<commit_message>
Update resume from Google Docs [2026-04-05 19:45:51 UTC]
</commit_message>
<xml_diff>
--- a/William_Richards_Resume.docx
+++ b/William_Richards_Resume.docx
@@ -71,7 +71,7 @@
           <w:szCs w:val="20"/>
           <w:rtl w:val="0"/>
         </w:rPr>
-        <w:t xml:space="preserve">richardsw2017@gmail.com  ·  (801) 755-8538  ·  </w:t>
+        <w:t xml:space="preserve">richardsw2017@gmail.com  |  (801) 755-8538  |  </w:t>
       </w:r>
       <w:hyperlink r:id="rId6">
         <w:r>
@@ -92,7 +92,7 @@
           <w:szCs w:val="20"/>
           <w:rtl w:val="0"/>
         </w:rPr>
-        <w:t xml:space="preserve">  ·  </w:t>
+        <w:t xml:space="preserve">  |  </w:t>
       </w:r>
       <w:hyperlink r:id="rId7">
         <w:r>
@@ -172,7 +172,7 @@
           <w:szCs w:val="20"/>
           <w:rtl w:val="0"/>
         </w:rPr>
-        <w:t xml:space="preserve">Senior Front-End Engineer with 9 years of experience, 7 in front-end, including 5 years delivering enterprise-grade web applications for Fortune 100 clients at ModelOp. Expert in Angular, TypeScript, and modern front-end architecture with a full-stack perspective spanning Python SDKs, automated testing infrastructure, and cloud services.</w:t>
+        <w:t xml:space="preserve">Senior Front-End Engineer with 9 years of experience building enterprise-scale web applications for Fortune 100 clients. Led front-end architecture on an AI governance platform at ModelOp, expanding scope into Python SDK development, test automation infrastructure, and cloud deployments. Deep expertise in Angular and TypeScript; actively working in React for modern full-stack projects.</w:t>
       </w:r>
       <w:r>
         <w:rPr>
@@ -851,7 +851,25 @@
           <w:szCs w:val="20"/>
           <w:rtl w:val="0"/>
         </w:rPr>
-        <w:t xml:space="preserve">  ·  </w:t>
+        <w:t xml:space="preserve">  </w:t>
+      </w:r>
+      <w:r>
+        <w:rPr>
+          <w:color w:val="374151"/>
+          <w:sz w:val="20"/>
+          <w:szCs w:val="20"/>
+          <w:rtl w:val="0"/>
+        </w:rPr>
+        <w:t xml:space="preserve"> |</w:t>
+      </w:r>
+      <w:r>
+        <w:rPr>
+          <w:color w:val="6b7280"/>
+          <w:sz w:val="20"/>
+          <w:szCs w:val="20"/>
+          <w:rtl w:val="0"/>
+        </w:rPr>
+        <w:t xml:space="preserve">  </w:t>
       </w:r>
       <w:r>
         <w:rPr>
@@ -903,7 +921,7 @@
           <w:szCs w:val="20"/>
           <w:rtl w:val="0"/>
         </w:rPr>
-        <w:t xml:space="preserve">Delivered enterprise features end-to-end for Fortune 100 clients using Angular 17+, TypeScript, RxJS, NgRx, and SCSS, applying Atomic Design to maintain zero critical regressions across major releases.</w:t>
+        <w:t xml:space="preserve">Owned front-end architecture end-to-end for an AI governance platform serving Fortune 100 clients, leading feature delivery across Angular 17+, TypeScript, RxJS, NgRx, and SCSS with zero critical regressions across major releases.</w:t>
       </w:r>
       <w:r>
         <w:rPr>
@@ -932,7 +950,7 @@
           <w:szCs w:val="20"/>
           <w:rtl w:val="0"/>
         </w:rPr>
-        <w:t xml:space="preserve">Redesigned the UI for WCAG 2.2 AA compliance and 320px responsiveness, integrating Lazy Loading and Tree Shaking to reduce initial load time by 40% and bundle size by 60%.</w:t>
+        <w:t xml:space="preserve">Drove a performance and accessibility overhaul: achieved WCAG 2.2 AA compliance and 320px responsiveness while cutting initial load time 40% and bundle size 60% via Lazy Loading and Tree Shaking.</w:t>
       </w:r>
       <w:r>
         <w:rPr>
@@ -1019,7 +1037,7 @@
           <w:szCs w:val="20"/>
           <w:rtl w:val="0"/>
         </w:rPr>
-        <w:t xml:space="preserve">Engineered RESTful APIs with Spring Boot and Spring Data JPA; collaborated across Java microservices and Docker/Kubernetes to diagnose and resolve production issues full-stack.</w:t>
+        <w:t xml:space="preserve">Contributed Spring Data JPA repository methods using derived query conventions; collaborated across Docker and Kubernetes environments to diagnose and resolve production issues alongside Java team.</w:t>
       </w:r>
       <w:r>
         <w:rPr>
@@ -1128,7 +1146,25 @@
           <w:szCs w:val="20"/>
           <w:rtl w:val="0"/>
         </w:rPr>
-        <w:t xml:space="preserve">  ·  </w:t>
+        <w:t xml:space="preserve">  </w:t>
+      </w:r>
+      <w:r>
+        <w:rPr>
+          <w:color w:val="374151"/>
+          <w:sz w:val="20"/>
+          <w:szCs w:val="20"/>
+          <w:rtl w:val="0"/>
+        </w:rPr>
+        <w:t xml:space="preserve"> |</w:t>
+      </w:r>
+      <w:r>
+        <w:rPr>
+          <w:color w:val="6b7280"/>
+          <w:sz w:val="20"/>
+          <w:szCs w:val="20"/>
+          <w:rtl w:val="0"/>
+        </w:rPr>
+        <w:t xml:space="preserve">  </w:t>
       </w:r>
       <w:r>
         <w:rPr>
@@ -1209,7 +1245,99 @@
           <w:szCs w:val="20"/>
           <w:rtl w:val="0"/>
         </w:rPr>
-        <w:t xml:space="preserve">Standardized reusable Vuetify components with Atomic Design and global state, reducing UI bugs across enterprise applications.</w:t>
+        <w:t xml:space="preserve">Deployed in a secure AWS environment using OAuth 2.0, CloudFormation, and IAM policies for consistent, auditable provisioning.</w:t>
+      </w:r>
+      <w:r>
+        <w:rPr>
+          <w:rtl w:val="0"/>
+        </w:rPr>
+      </w:r>
+    </w:p>
+    <w:p>
+      <w:pPr>
+        <w:spacing w:line="80" w:lineRule="auto"/>
+        <w:rPr>
+          <w:rFonts w:ascii="Times New Roman" w:cs="Times New Roman" w:eastAsia="Times New Roman" w:hAnsi="Times New Roman"/>
+          <w:sz w:val="20"/>
+          <w:szCs w:val="20"/>
+        </w:rPr>
+      </w:pPr>
+      <w:r>
+        <w:rPr>
+          <w:rtl w:val="0"/>
+        </w:rPr>
+      </w:r>
+    </w:p>
+    <w:p>
+      <w:pPr>
+        <w:tabs>
+          <w:tab w:val="right" w:leader="none" w:pos="9360"/>
+        </w:tabs>
+        <w:spacing w:after="20" w:before="100" w:line="240" w:lineRule="auto"/>
+        <w:rPr>
+          <w:rFonts w:ascii="Times New Roman" w:cs="Times New Roman" w:eastAsia="Times New Roman" w:hAnsi="Times New Roman"/>
+          <w:sz w:val="20"/>
+          <w:szCs w:val="20"/>
+        </w:rPr>
+      </w:pPr>
+      <w:r>
+        <w:rPr>
+          <w:b w:val="1"/>
+          <w:bCs w:val="1"/>
+          <w:color w:val="111827"/>
+          <w:rtl w:val="0"/>
+        </w:rPr>
+        <w:t xml:space="preserve">Software Developer</w:t>
+      </w:r>
+      <w:r>
+        <w:rPr>
+          <w:color w:val="6b7280"/>
+          <w:sz w:val="20"/>
+          <w:szCs w:val="20"/>
+          <w:rtl w:val="0"/>
+        </w:rPr>
+        <w:t xml:space="preserve">  </w:t>
+      </w:r>
+      <w:r>
+        <w:rPr>
+          <w:color w:val="374151"/>
+          <w:sz w:val="20"/>
+          <w:szCs w:val="20"/>
+          <w:rtl w:val="0"/>
+        </w:rPr>
+        <w:t xml:space="preserve"> |</w:t>
+      </w:r>
+      <w:r>
+        <w:rPr>
+          <w:color w:val="6b7280"/>
+          <w:sz w:val="20"/>
+          <w:szCs w:val="20"/>
+          <w:rtl w:val="0"/>
+        </w:rPr>
+        <w:t xml:space="preserve">  </w:t>
+      </w:r>
+      <w:r>
+        <w:rPr>
+          <w:b w:val="1"/>
+          <w:bCs w:val="1"/>
+          <w:color w:val="1a56db"/>
+          <w:sz w:val="21"/>
+          <w:szCs w:val="21"/>
+          <w:rtl w:val="0"/>
+        </w:rPr>
+        <w:t xml:space="preserve">University of Utah – Dept. of Human Genetics</w:t>
+        <w:tab/>
+      </w:r>
+      <w:r>
+        <w:rPr>
+          <w:i w:val="1"/>
+          <w:iCs w:val="1"/>
+          <w:color w:val="6b7280"/>
+          <w:sz w:val="20"/>
+          <w:szCs w:val="20"/>
+          <w:rtl w:val="0"/>
+        </w:rPr>
+        <w:t xml:space="preserve">Jun 2017 – Apr 2019</w:t>
       </w:r>
       <w:r>
         <w:rPr>
@@ -1238,81 +1366,7 @@
           <w:szCs w:val="20"/>
           <w:rtl w:val="0"/>
         </w:rPr>
-        <w:t xml:space="preserve">Deployed in a secure AWS environment using OAuth 2.0, CloudFormation, and IAM policies for consistent, auditable provisioning.</w:t>
-      </w:r>
-      <w:r>
-        <w:rPr>
-          <w:rtl w:val="0"/>
-        </w:rPr>
-      </w:r>
-    </w:p>
-    <w:p>
-      <w:pPr>
-        <w:spacing w:line="80" w:lineRule="auto"/>
-        <w:rPr>
-          <w:rFonts w:ascii="Times New Roman" w:cs="Times New Roman" w:eastAsia="Times New Roman" w:hAnsi="Times New Roman"/>
-          <w:sz w:val="20"/>
-          <w:szCs w:val="20"/>
-        </w:rPr>
-      </w:pPr>
-      <w:r>
-        <w:rPr>
-          <w:rtl w:val="0"/>
-        </w:rPr>
-      </w:r>
-    </w:p>
-    <w:p>
-      <w:pPr>
-        <w:tabs>
-          <w:tab w:val="right" w:leader="none" w:pos="9360"/>
-        </w:tabs>
-        <w:spacing w:after="20" w:before="100" w:line="240" w:lineRule="auto"/>
-        <w:rPr>
-          <w:rFonts w:ascii="Times New Roman" w:cs="Times New Roman" w:eastAsia="Times New Roman" w:hAnsi="Times New Roman"/>
-          <w:sz w:val="20"/>
-          <w:szCs w:val="20"/>
-        </w:rPr>
-      </w:pPr>
-      <w:r>
-        <w:rPr>
-          <w:b w:val="1"/>
-          <w:bCs w:val="1"/>
-          <w:color w:val="111827"/>
-          <w:rtl w:val="0"/>
-        </w:rPr>
-        <w:t xml:space="preserve">Software Developer</w:t>
-      </w:r>
-      <w:r>
-        <w:rPr>
-          <w:color w:val="6b7280"/>
-          <w:sz w:val="20"/>
-          <w:szCs w:val="20"/>
-          <w:rtl w:val="0"/>
-        </w:rPr>
-        <w:t xml:space="preserve">  ·  </w:t>
-      </w:r>
-      <w:r>
-        <w:rPr>
-          <w:b w:val="1"/>
-          <w:bCs w:val="1"/>
-          <w:color w:val="1a56db"/>
-          <w:sz w:val="21"/>
-          <w:szCs w:val="21"/>
-          <w:rtl w:val="0"/>
-        </w:rPr>
-        <w:t xml:space="preserve">University of Utah – Dept. of Human Genetics</w:t>
-        <w:tab/>
-      </w:r>
-      <w:r>
-        <w:rPr>
-          <w:i w:val="1"/>
-          <w:iCs w:val="1"/>
-          <w:color w:val="6b7280"/>
-          <w:sz w:val="20"/>
-          <w:szCs w:val="20"/>
-          <w:rtl w:val="0"/>
-        </w:rPr>
-        <w:t xml:space="preserve">Jun 2017 – Apr 2019</w:t>
+        <w:t xml:space="preserve">Refactored genomic variant-detection pipelines in C++11/CMake, achieving a 10× build-time reduction; built high-throughput ALU detection tools using FASTAHACK, MINIMAP2, and lock-free hash tables.</w:t>
       </w:r>
       <w:r>
         <w:rPr>
@@ -1341,66 +1395,96 @@
           <w:szCs w:val="20"/>
           <w:rtl w:val="0"/>
         </w:rPr>
-        <w:t xml:space="preserve">Refactored genomic variant-detection pipelines in C++11/CMake with parallel compilation, achieving a 10× build-time reduction via Snakemake integration.</w:t>
-      </w:r>
-      <w:r>
-        <w:rPr>
-          <w:rtl w:val="0"/>
-        </w:rPr>
-      </w:r>
-    </w:p>
-    <w:p>
-      <w:pPr>
-        <w:numPr>
-          <w:ilvl w:val="0"/>
-          <w:numId w:val="1"/>
-        </w:numPr>
+        <w:t xml:space="preserve">Trained TensorFlow CNN classifiers to detect tissue contamination in xenograft genomic data, achieving 92% accuracy for downstream oncological research.</w:t>
+      </w:r>
+    </w:p>
+    <w:p>
+      <w:pPr>
         <w:spacing w:after="40" w:line="240" w:lineRule="auto"/>
-        <w:ind w:left="360" w:hanging="260"/>
-        <w:rPr>
-          <w:rFonts w:ascii="Times New Roman" w:cs="Times New Roman" w:eastAsia="Times New Roman" w:hAnsi="Times New Roman"/>
-          <w:sz w:val="20"/>
-          <w:szCs w:val="20"/>
-        </w:rPr>
-      </w:pPr>
-      <w:r>
+        <w:ind w:left="0" w:firstLine="0"/>
         <w:rPr>
           <w:color w:val="374151"/>
           <w:sz w:val="20"/>
           <w:szCs w:val="20"/>
-          <w:rtl w:val="0"/>
-        </w:rPr>
-        <w:t xml:space="preserve">Built high-throughput ALU detection tools using FASTAHACK, MINIMAP2, and lock-free hash tables with multithreading.</w:t>
-      </w:r>
-      <w:r>
-        <w:rPr>
-          <w:rtl w:val="0"/>
-        </w:rPr>
-      </w:r>
-    </w:p>
-    <w:p>
-      <w:pPr>
-        <w:numPr>
-          <w:ilvl w:val="0"/>
-          <w:numId w:val="1"/>
-        </w:numPr>
-        <w:spacing w:after="40" w:line="240" w:lineRule="auto"/>
-        <w:ind w:left="360" w:hanging="260"/>
-        <w:rPr>
-          <w:rFonts w:ascii="Times New Roman" w:cs="Times New Roman" w:eastAsia="Times New Roman" w:hAnsi="Times New Roman"/>
-          <w:sz w:val="20"/>
-          <w:szCs w:val="20"/>
-        </w:rPr>
-      </w:pPr>
-      <w:r>
+        </w:rPr>
+      </w:pPr>
+      <w:r>
+        <w:rPr>
+          <w:rtl w:val="0"/>
+        </w:rPr>
+      </w:r>
+    </w:p>
+    <w:p>
+      <w:pPr>
+        <w:pBdr>
+          <w:bottom w:color="1a56db" w:space="0" w:sz="6" w:val="single"/>
+        </w:pBdr>
+        <w:spacing w:after="60" w:before="120" w:line="240" w:lineRule="auto"/>
+        <w:rPr>
+          <w:rFonts w:ascii="Times New Roman" w:cs="Times New Roman" w:eastAsia="Times New Roman" w:hAnsi="Times New Roman"/>
+          <w:sz w:val="20"/>
+          <w:szCs w:val="20"/>
+        </w:rPr>
+      </w:pPr>
+      <w:r>
+        <w:rPr>
+          <w:b w:val="1"/>
+          <w:bCs w:val="1"/>
+          <w:color w:val="1a56db"/>
+          <w:sz w:val="18"/>
+          <w:szCs w:val="18"/>
+          <w:rtl w:val="0"/>
+        </w:rPr>
+        <w:t xml:space="preserve">PROJECTS</w:t>
+      </w:r>
+      <w:r>
+        <w:rPr>
+          <w:rtl w:val="0"/>
+        </w:rPr>
+      </w:r>
+    </w:p>
+    <w:p>
+      <w:pPr>
+        <w:tabs>
+          <w:tab w:val="right" w:leader="none" w:pos="9360"/>
+        </w:tabs>
+        <w:spacing w:after="20" w:before="60" w:line="240" w:lineRule="auto"/>
         <w:rPr>
           <w:color w:val="374151"/>
           <w:sz w:val="20"/>
           <w:szCs w:val="20"/>
-          <w:rtl w:val="0"/>
-        </w:rPr>
-        <w:t xml:space="preserve">Trained TensorFlow CNN classifiers to detect tissue contamination in xenograft genomic data, achieving 92% accuracy for downstream oncological research.</w:t>
-      </w:r>
+        </w:rPr>
+      </w:pPr>
+      <w:r>
+        <w:rPr>
+          <w:b w:val="1"/>
+          <w:bCs w:val="1"/>
+          <w:color w:val="111827"/>
+          <w:sz w:val="21"/>
+          <w:szCs w:val="21"/>
+          <w:rtl w:val="0"/>
+        </w:rPr>
+        <w:t xml:space="preserve">Blotify</w:t>
+      </w:r>
+      <w:r>
+        <w:rPr>
+          <w:color w:val="374151"/>
+          <w:sz w:val="20"/>
+          <w:szCs w:val="20"/>
+          <w:rtl w:val="0"/>
+        </w:rPr>
+        <w:t xml:space="preserve">  |  React, Next.js  |  Automated western blot and cytokine array quantification; deployed and actively used as a production research tool at a university lab  |  </w:t>
+      </w:r>
+      <w:hyperlink r:id="rId8">
+        <w:r>
+          <w:rPr>
+            <w:sz w:val="20"/>
+            <w:szCs w:val="20"/>
+            <w:rtl w:val="0"/>
+          </w:rPr>
+          <w:t xml:space="preserve">blotify.dev</w:t>
+        </w:r>
+      </w:hyperlink>
       <w:r>
         <w:rPr>
           <w:rtl w:val="0"/>
@@ -1484,7 +1568,7 @@
           <w:szCs w:val="20"/>
           <w:rtl w:val="0"/>
         </w:rPr>
-        <w:t xml:space="preserve">  ·  Carleton College, Northfield, MN</w:t>
+        <w:t xml:space="preserve">  |  Carleton College, Northfield, MN</w:t>
         <w:tab/>
       </w:r>
       <w:r>
@@ -1509,7 +1593,7 @@
         <w:tabs>
           <w:tab w:val="right" w:leader="none" w:pos="9360"/>
         </w:tabs>
-        <w:spacing w:before="60" w:line="240" w:lineRule="auto"/>
+        <w:spacing w:after="20" w:before="60" w:line="240" w:lineRule="auto"/>
         <w:rPr>
           <w:b w:val="1"/>
           <w:bCs w:val="1"/>
@@ -1518,6 +1602,58 @@
           <w:szCs w:val="52"/>
         </w:rPr>
       </w:pPr>
+      <w:r>
+        <w:rPr>
+          <w:b w:val="1"/>
+          <w:bCs w:val="1"/>
+          <w:color w:val="111827"/>
+          <w:sz w:val="21"/>
+          <w:szCs w:val="21"/>
+          <w:rtl w:val="0"/>
+        </w:rPr>
+        <w:t xml:space="preserve">AWS Certified Cloud Practitioner  </w:t>
+      </w:r>
+      <w:r>
+        <w:rPr>
+          <w:color w:val="374151"/>
+          <w:sz w:val="20"/>
+          <w:szCs w:val="20"/>
+          <w:rtl w:val="0"/>
+        </w:rPr>
+        <w:t xml:space="preserve"> |</w:t>
+      </w:r>
+      <w:r>
+        <w:rPr>
+          <w:b w:val="1"/>
+          <w:bCs w:val="1"/>
+          <w:color w:val="111827"/>
+          <w:sz w:val="21"/>
+          <w:szCs w:val="21"/>
+          <w:rtl w:val="0"/>
+        </w:rPr>
+        <w:t xml:space="preserve">  AWS Certified AI Practitioner</w:t>
+      </w:r>
+      <w:r>
+        <w:rPr>
+          <w:color w:val="374151"/>
+          <w:sz w:val="20"/>
+          <w:szCs w:val="20"/>
+          <w:rtl w:val="0"/>
+        </w:rPr>
+        <w:t xml:space="preserve">  ·  </w:t>
+        <w:tab/>
+      </w:r>
+      <w:r>
+        <w:rPr>
+          <w:i w:val="1"/>
+          <w:iCs w:val="1"/>
+          <w:color w:val="6b7280"/>
+          <w:sz w:val="20"/>
+          <w:szCs w:val="20"/>
+          <w:rtl w:val="0"/>
+        </w:rPr>
+        <w:t xml:space="preserve">2026 – 2029</w:t>
+      </w:r>
       <w:r>
         <w:rPr>
           <w:rtl w:val="0"/>

</xml_diff>

<commit_message>
Update resume from Google Docs [2026-04-06 04:48:02 UTC]
</commit_message>
<xml_diff>
--- a/William_Richards_Resume.docx
+++ b/William_Richards_Resume.docx
@@ -172,7 +172,16 @@
           <w:szCs w:val="20"/>
           <w:rtl w:val="0"/>
         </w:rPr>
-        <w:t xml:space="preserve">Senior Front-End Engineer with 9 years of experience building enterprise-scale web applications for Fortune 100 clients. Led front-end architecture on an AI governance platform at ModelOp, expanding scope into Python SDK development, test automation infrastructure, and cloud deployments. Deep expertise in Angular and TypeScript; actively working in React for modern full-stack projects.</w:t>
+        <w:t xml:space="preserve">Software Engineer with 9 years of experience, including 7 years specializing in front-end development and 5 years building enterprise-scale web applications for Fortune 500 clients.</w:t>
+      </w:r>
+      <w:r>
+        <w:rPr>
+          <w:color w:val="374151"/>
+          <w:sz w:val="20"/>
+          <w:szCs w:val="20"/>
+          <w:rtl w:val="0"/>
+        </w:rPr>
+        <w:t xml:space="preserve"> Led front-end architecture on an AI governance platform at ModelOp, expanding scope into Python SDK development, test automation infrastructure, and cloud deployments. Deep expertise in Angular and TypeScript; actively working in React for modern full-stack projects.</w:t>
       </w:r>
       <w:r>
         <w:rPr>
@@ -1008,7 +1017,7 @@
           <w:szCs w:val="20"/>
           <w:rtl w:val="0"/>
         </w:rPr>
-        <w:t xml:space="preserve">Expanded scope beyond front-end to build reusable test automation infrastructure: extended the Python SDK to expose key REST API endpoints and automated 20 of 400 manual regression tests using pytest and Selenium, accelerating future coverage.</w:t>
+        <w:t xml:space="preserve">Built a test automation SDK in Python abstracting common UI workflows into reusable, composable functions, enabling scalable pytest/Selenium test authoring; automated 20 of 400 manual regression tests as an initial implementation</w:t>
       </w:r>
       <w:r>
         <w:rPr>
@@ -1396,22 +1405,6 @@
           <w:rtl w:val="0"/>
         </w:rPr>
         <w:t xml:space="preserve">Trained TensorFlow CNN classifiers to detect tissue contamination in xenograft genomic data, achieving 92% accuracy for downstream oncological research.</w:t>
-      </w:r>
-    </w:p>
-    <w:p>
-      <w:pPr>
-        <w:spacing w:after="40" w:line="240" w:lineRule="auto"/>
-        <w:ind w:left="0" w:firstLine="0"/>
-        <w:rPr>
-          <w:color w:val="374151"/>
-          <w:sz w:val="20"/>
-          <w:szCs w:val="20"/>
-        </w:rPr>
-      </w:pPr>
-      <w:r>
-        <w:rPr>
-          <w:rtl w:val="0"/>
-        </w:rPr>
       </w:r>
     </w:p>
     <w:p>

</xml_diff>

<commit_message>
Update resume from Google Docs [2026-04-12 22:15:48 UTC]
</commit_message>
<xml_diff>
--- a/William_Richards_Resume.docx
+++ b/William_Richards_Resume.docx
@@ -1256,21 +1256,6 @@
         </w:rPr>
         <w:t xml:space="preserve">Deployed in a secure AWS environment using OAuth 2.0, CloudFormation, and IAM policies for consistent, auditable provisioning.</w:t>
       </w:r>
-      <w:r>
-        <w:rPr>
-          <w:rtl w:val="0"/>
-        </w:rPr>
-      </w:r>
-    </w:p>
-    <w:p>
-      <w:pPr>
-        <w:spacing w:line="80" w:lineRule="auto"/>
-        <w:rPr>
-          <w:rFonts w:ascii="Times New Roman" w:cs="Times New Roman" w:eastAsia="Times New Roman" w:hAnsi="Times New Roman"/>
-          <w:sz w:val="20"/>
-          <w:szCs w:val="20"/>
-        </w:rPr>
-      </w:pPr>
       <w:r>
         <w:rPr>
           <w:rtl w:val="0"/>

</xml_diff>

<commit_message>
Update resume from Google Docs [2026-04-30 05:34:19 UTC]
</commit_message>
<xml_diff>
--- a/William_Richards_Resume.docx
+++ b/William_Richards_Resume.docx
@@ -198,6 +198,687 @@
           <w:szCs w:val="20"/>
         </w:rPr>
       </w:pPr>
+      <w:r>
+        <w:rPr>
+          <w:rtl w:val="0"/>
+        </w:rPr>
+      </w:r>
+    </w:p>
+    <w:p>
+      <w:pPr>
+        <w:spacing w:line="80" w:lineRule="auto"/>
+        <w:rPr>
+          <w:rFonts w:ascii="Times New Roman" w:cs="Times New Roman" w:eastAsia="Times New Roman" w:hAnsi="Times New Roman"/>
+          <w:sz w:val="20"/>
+          <w:szCs w:val="20"/>
+        </w:rPr>
+      </w:pPr>
+      <w:r>
+        <w:rPr>
+          <w:rtl w:val="0"/>
+        </w:rPr>
+      </w:r>
+    </w:p>
+    <w:p>
+      <w:pPr>
+        <w:pBdr>
+          <w:bottom w:color="1a56db" w:space="0" w:sz="6" w:val="single"/>
+        </w:pBdr>
+        <w:spacing w:after="60" w:before="120" w:line="240" w:lineRule="auto"/>
+        <w:rPr>
+          <w:rFonts w:ascii="Times New Roman" w:cs="Times New Roman" w:eastAsia="Times New Roman" w:hAnsi="Times New Roman"/>
+          <w:sz w:val="20"/>
+          <w:szCs w:val="20"/>
+        </w:rPr>
+      </w:pPr>
+      <w:r>
+        <w:rPr>
+          <w:b w:val="1"/>
+          <w:bCs w:val="1"/>
+          <w:color w:val="1a56db"/>
+          <w:sz w:val="18"/>
+          <w:szCs w:val="18"/>
+          <w:rtl w:val="0"/>
+        </w:rPr>
+        <w:t xml:space="preserve">EXPERIENCE</w:t>
+      </w:r>
+      <w:r>
+        <w:rPr>
+          <w:rtl w:val="0"/>
+        </w:rPr>
+      </w:r>
+    </w:p>
+    <w:p>
+      <w:pPr>
+        <w:tabs>
+          <w:tab w:val="right" w:leader="none" w:pos="9360"/>
+        </w:tabs>
+        <w:spacing w:after="20" w:before="100" w:line="240" w:lineRule="auto"/>
+        <w:rPr>
+          <w:rFonts w:ascii="Times New Roman" w:cs="Times New Roman" w:eastAsia="Times New Roman" w:hAnsi="Times New Roman"/>
+          <w:sz w:val="20"/>
+          <w:szCs w:val="20"/>
+        </w:rPr>
+      </w:pPr>
+      <w:r>
+        <w:rPr>
+          <w:b w:val="1"/>
+          <w:bCs w:val="1"/>
+          <w:color w:val="111827"/>
+          <w:rtl w:val="0"/>
+        </w:rPr>
+        <w:t xml:space="preserve">Senior Front-End Engineer</w:t>
+      </w:r>
+      <w:r>
+        <w:rPr>
+          <w:color w:val="6b7280"/>
+          <w:sz w:val="20"/>
+          <w:szCs w:val="20"/>
+          <w:rtl w:val="0"/>
+        </w:rPr>
+        <w:t xml:space="preserve">  </w:t>
+      </w:r>
+      <w:r>
+        <w:rPr>
+          <w:color w:val="374151"/>
+          <w:sz w:val="20"/>
+          <w:szCs w:val="20"/>
+          <w:rtl w:val="0"/>
+        </w:rPr>
+        <w:t xml:space="preserve"> |</w:t>
+      </w:r>
+      <w:r>
+        <w:rPr>
+          <w:color w:val="6b7280"/>
+          <w:sz w:val="20"/>
+          <w:szCs w:val="20"/>
+          <w:rtl w:val="0"/>
+        </w:rPr>
+        <w:t xml:space="preserve">  </w:t>
+      </w:r>
+      <w:r>
+        <w:rPr>
+          <w:b w:val="1"/>
+          <w:bCs w:val="1"/>
+          <w:color w:val="1a56db"/>
+          <w:sz w:val="21"/>
+          <w:szCs w:val="21"/>
+          <w:rtl w:val="0"/>
+        </w:rPr>
+        <w:t xml:space="preserve">ModelOp</w:t>
+        <w:tab/>
+      </w:r>
+      <w:r>
+        <w:rPr>
+          <w:i w:val="1"/>
+          <w:iCs w:val="1"/>
+          <w:color w:val="6b7280"/>
+          <w:sz w:val="20"/>
+          <w:szCs w:val="20"/>
+          <w:rtl w:val="0"/>
+        </w:rPr>
+        <w:t xml:space="preserve">Apr 2021 – Present</w:t>
+      </w:r>
+      <w:r>
+        <w:rPr>
+          <w:rtl w:val="0"/>
+        </w:rPr>
+      </w:r>
+    </w:p>
+    <w:p>
+      <w:pPr>
+        <w:numPr>
+          <w:ilvl w:val="0"/>
+          <w:numId w:val="1"/>
+        </w:numPr>
+        <w:spacing w:after="40" w:line="240" w:lineRule="auto"/>
+        <w:ind w:left="360" w:hanging="260"/>
+        <w:rPr>
+          <w:rFonts w:ascii="Times New Roman" w:cs="Times New Roman" w:eastAsia="Times New Roman" w:hAnsi="Times New Roman"/>
+          <w:sz w:val="20"/>
+          <w:szCs w:val="20"/>
+        </w:rPr>
+      </w:pPr>
+      <w:r>
+        <w:rPr>
+          <w:color w:val="374151"/>
+          <w:sz w:val="20"/>
+          <w:szCs w:val="20"/>
+          <w:rtl w:val="0"/>
+        </w:rPr>
+        <w:t xml:space="preserve">Owned front-end architecture end-to-end for an AI governance platform serving Fortune 100 clients, leading feature delivery across Angular 17+, TypeScript, RxJS, NgRx, and SCSS with zero critical regressions across major releases.</w:t>
+      </w:r>
+      <w:r>
+        <w:rPr>
+          <w:rtl w:val="0"/>
+        </w:rPr>
+      </w:r>
+    </w:p>
+    <w:p>
+      <w:pPr>
+        <w:numPr>
+          <w:ilvl w:val="0"/>
+          <w:numId w:val="1"/>
+        </w:numPr>
+        <w:spacing w:after="40" w:line="240" w:lineRule="auto"/>
+        <w:ind w:left="360" w:hanging="260"/>
+        <w:rPr>
+          <w:rFonts w:ascii="Times New Roman" w:cs="Times New Roman" w:eastAsia="Times New Roman" w:hAnsi="Times New Roman"/>
+          <w:sz w:val="20"/>
+          <w:szCs w:val="20"/>
+        </w:rPr>
+      </w:pPr>
+      <w:r>
+        <w:rPr>
+          <w:color w:val="374151"/>
+          <w:sz w:val="20"/>
+          <w:szCs w:val="20"/>
+          <w:rtl w:val="0"/>
+        </w:rPr>
+        <w:t xml:space="preserve">Drove a performance and accessibility overhaul: achieved WCAG 2.2 AA compliance and 320px responsiveness while cutting initial load time 40% and bundle size 60% via Lazy Loading and Tree Shaking.</w:t>
+      </w:r>
+      <w:r>
+        <w:rPr>
+          <w:rtl w:val="0"/>
+        </w:rPr>
+      </w:r>
+    </w:p>
+    <w:p>
+      <w:pPr>
+        <w:numPr>
+          <w:ilvl w:val="0"/>
+          <w:numId w:val="1"/>
+        </w:numPr>
+        <w:spacing w:after="40" w:line="240" w:lineRule="auto"/>
+        <w:ind w:left="360" w:hanging="260"/>
+        <w:rPr>
+          <w:rFonts w:ascii="Times New Roman" w:cs="Times New Roman" w:eastAsia="Times New Roman" w:hAnsi="Times New Roman"/>
+          <w:sz w:val="20"/>
+          <w:szCs w:val="20"/>
+        </w:rPr>
+      </w:pPr>
+      <w:r>
+        <w:rPr>
+          <w:color w:val="374151"/>
+          <w:sz w:val="20"/>
+          <w:szCs w:val="20"/>
+          <w:rtl w:val="0"/>
+        </w:rPr>
+        <w:t xml:space="preserve">Introduced Tailwind CSS and a token-based design system (SCSS + Figma Tokens Studio) across a 5-engineer front-end team, standardizing styling conventions and eliminating a class of style-related bugs.</w:t>
+      </w:r>
+      <w:r>
+        <w:rPr>
+          <w:rtl w:val="0"/>
+        </w:rPr>
+      </w:r>
+    </w:p>
+    <w:p>
+      <w:pPr>
+        <w:numPr>
+          <w:ilvl w:val="0"/>
+          <w:numId w:val="1"/>
+        </w:numPr>
+        <w:spacing w:after="40" w:line="240" w:lineRule="auto"/>
+        <w:ind w:left="360" w:hanging="260"/>
+        <w:rPr>
+          <w:rFonts w:ascii="Times New Roman" w:cs="Times New Roman" w:eastAsia="Times New Roman" w:hAnsi="Times New Roman"/>
+          <w:sz w:val="20"/>
+          <w:szCs w:val="20"/>
+        </w:rPr>
+      </w:pPr>
+      <w:r>
+        <w:rPr>
+          <w:color w:val="374151"/>
+          <w:sz w:val="20"/>
+          <w:szCs w:val="20"/>
+          <w:rtl w:val="0"/>
+        </w:rPr>
+        <w:t xml:space="preserve">Built a test automation SDK in Python abstracting common UI workflows into reusable, composable functions, enabling scalable pytest/Selenium test authoring; automated 20 of 400 manual regression tests as an initial implementation</w:t>
+      </w:r>
+      <w:r>
+        <w:rPr>
+          <w:rtl w:val="0"/>
+        </w:rPr>
+      </w:r>
+    </w:p>
+    <w:p>
+      <w:pPr>
+        <w:numPr>
+          <w:ilvl w:val="0"/>
+          <w:numId w:val="1"/>
+        </w:numPr>
+        <w:spacing w:after="40" w:line="240" w:lineRule="auto"/>
+        <w:ind w:left="360" w:hanging="260"/>
+        <w:rPr>
+          <w:rFonts w:ascii="Times New Roman" w:cs="Times New Roman" w:eastAsia="Times New Roman" w:hAnsi="Times New Roman"/>
+          <w:sz w:val="20"/>
+          <w:szCs w:val="20"/>
+        </w:rPr>
+      </w:pPr>
+      <w:r>
+        <w:rPr>
+          <w:color w:val="374151"/>
+          <w:sz w:val="20"/>
+          <w:szCs w:val="20"/>
+          <w:rtl w:val="0"/>
+        </w:rPr>
+        <w:t xml:space="preserve">Contributed Spring Data JPA repository methods using derived query conventions; collaborated across Docker and Kubernetes environments to diagnose and resolve production issues alongside Java team.</w:t>
+      </w:r>
+      <w:r>
+        <w:rPr>
+          <w:rtl w:val="0"/>
+        </w:rPr>
+      </w:r>
+    </w:p>
+    <w:p>
+      <w:pPr>
+        <w:numPr>
+          <w:ilvl w:val="0"/>
+          <w:numId w:val="1"/>
+        </w:numPr>
+        <w:spacing w:after="40" w:line="240" w:lineRule="auto"/>
+        <w:ind w:left="360" w:hanging="260"/>
+        <w:rPr>
+          <w:rFonts w:ascii="Times New Roman" w:cs="Times New Roman" w:eastAsia="Times New Roman" w:hAnsi="Times New Roman"/>
+          <w:sz w:val="20"/>
+          <w:szCs w:val="20"/>
+        </w:rPr>
+      </w:pPr>
+      <w:r>
+        <w:rPr>
+          <w:color w:val="374151"/>
+          <w:sz w:val="20"/>
+          <w:szCs w:val="20"/>
+          <w:rtl w:val="0"/>
+        </w:rPr>
+        <w:t xml:space="preserve">Refactored change detection to a zoneless, signal-based architecture, eliminating Zone.js overhead and reducing unnecessary CD cycles; measured runtime improvements via Lighthouse, yielding meaningful reductions in Total Blocking Time (TBT).</w:t>
+      </w:r>
+      <w:r>
+        <w:rPr>
+          <w:rtl w:val="0"/>
+        </w:rPr>
+      </w:r>
+    </w:p>
+    <w:p>
+      <w:pPr>
+        <w:numPr>
+          <w:ilvl w:val="0"/>
+          <w:numId w:val="1"/>
+        </w:numPr>
+        <w:spacing w:after="40" w:line="240" w:lineRule="auto"/>
+        <w:ind w:left="360" w:hanging="260"/>
+        <w:rPr>
+          <w:rFonts w:ascii="Times New Roman" w:cs="Times New Roman" w:eastAsia="Times New Roman" w:hAnsi="Times New Roman"/>
+          <w:sz w:val="20"/>
+          <w:szCs w:val="20"/>
+        </w:rPr>
+      </w:pPr>
+      <w:r>
+        <w:rPr>
+          <w:color w:val="374151"/>
+          <w:sz w:val="20"/>
+          <w:szCs w:val="20"/>
+          <w:rtl w:val="0"/>
+        </w:rPr>
+        <w:t xml:space="preserve">Drove adoption of Chart.js, Angular 17, and AI development tooling by presenting technical roadmaps to the Director of UI/UX, VP of Product, and CTO.</w:t>
+      </w:r>
+      <w:r>
+        <w:rPr>
+          <w:rtl w:val="0"/>
+        </w:rPr>
+      </w:r>
+    </w:p>
+    <w:p>
+      <w:pPr>
+        <w:spacing w:line="80" w:lineRule="auto"/>
+        <w:rPr>
+          <w:rFonts w:ascii="Times New Roman" w:cs="Times New Roman" w:eastAsia="Times New Roman" w:hAnsi="Times New Roman"/>
+          <w:sz w:val="20"/>
+          <w:szCs w:val="20"/>
+        </w:rPr>
+      </w:pPr>
+      <w:r>
+        <w:rPr>
+          <w:rtl w:val="0"/>
+        </w:rPr>
+      </w:r>
+    </w:p>
+    <w:p>
+      <w:pPr>
+        <w:tabs>
+          <w:tab w:val="right" w:leader="none" w:pos="9360"/>
+        </w:tabs>
+        <w:spacing w:after="20" w:before="100" w:line="240" w:lineRule="auto"/>
+        <w:rPr>
+          <w:rFonts w:ascii="Times New Roman" w:cs="Times New Roman" w:eastAsia="Times New Roman" w:hAnsi="Times New Roman"/>
+          <w:sz w:val="20"/>
+          <w:szCs w:val="20"/>
+        </w:rPr>
+      </w:pPr>
+      <w:r>
+        <w:rPr>
+          <w:b w:val="1"/>
+          <w:bCs w:val="1"/>
+          <w:color w:val="111827"/>
+          <w:rtl w:val="0"/>
+        </w:rPr>
+        <w:t xml:space="preserve">Web Developer</w:t>
+      </w:r>
+      <w:r>
+        <w:rPr>
+          <w:color w:val="6b7280"/>
+          <w:sz w:val="20"/>
+          <w:szCs w:val="20"/>
+          <w:rtl w:val="0"/>
+        </w:rPr>
+        <w:t xml:space="preserve">  </w:t>
+      </w:r>
+      <w:r>
+        <w:rPr>
+          <w:color w:val="374151"/>
+          <w:sz w:val="20"/>
+          <w:szCs w:val="20"/>
+          <w:rtl w:val="0"/>
+        </w:rPr>
+        <w:t xml:space="preserve"> |</w:t>
+      </w:r>
+      <w:r>
+        <w:rPr>
+          <w:color w:val="6b7280"/>
+          <w:sz w:val="20"/>
+          <w:szCs w:val="20"/>
+          <w:rtl w:val="0"/>
+        </w:rPr>
+        <w:t xml:space="preserve">  </w:t>
+      </w:r>
+      <w:r>
+        <w:rPr>
+          <w:b w:val="1"/>
+          <w:bCs w:val="1"/>
+          <w:color w:val="1a56db"/>
+          <w:sz w:val="21"/>
+          <w:szCs w:val="21"/>
+          <w:rtl w:val="0"/>
+        </w:rPr>
+        <w:t xml:space="preserve">University of Utah – Dept. of Human Genetics</w:t>
+        <w:tab/>
+      </w:r>
+      <w:r>
+        <w:rPr>
+          <w:i w:val="1"/>
+          <w:iCs w:val="1"/>
+          <w:color w:val="6b7280"/>
+          <w:sz w:val="20"/>
+          <w:szCs w:val="20"/>
+          <w:rtl w:val="0"/>
+        </w:rPr>
+        <w:t xml:space="preserve">May 2019 – Dec 2020</w:t>
+      </w:r>
+      <w:r>
+        <w:rPr>
+          <w:rtl w:val="0"/>
+        </w:rPr>
+      </w:r>
+    </w:p>
+    <w:p>
+      <w:pPr>
+        <w:numPr>
+          <w:ilvl w:val="0"/>
+          <w:numId w:val="1"/>
+        </w:numPr>
+        <w:spacing w:after="40" w:line="240" w:lineRule="auto"/>
+        <w:ind w:left="360" w:hanging="260"/>
+        <w:rPr>
+          <w:rFonts w:ascii="Times New Roman" w:cs="Times New Roman" w:eastAsia="Times New Roman" w:hAnsi="Times New Roman"/>
+          <w:sz w:val="20"/>
+          <w:szCs w:val="20"/>
+        </w:rPr>
+      </w:pPr>
+      <w:r>
+        <w:rPr>
+          <w:color w:val="374151"/>
+          <w:sz w:val="20"/>
+          <w:szCs w:val="20"/>
+          <w:rtl w:val="0"/>
+        </w:rPr>
+        <w:t xml:space="preserve">Built a genomic pedigree visualization platform with Vue, D3, and Node.js; leveraged Vuex, Web Workers, and OffscreenCanvas for high-interactivity rendering.</w:t>
+      </w:r>
+      <w:r>
+        <w:rPr>
+          <w:rtl w:val="0"/>
+        </w:rPr>
+      </w:r>
+    </w:p>
+    <w:p>
+      <w:pPr>
+        <w:numPr>
+          <w:ilvl w:val="0"/>
+          <w:numId w:val="1"/>
+        </w:numPr>
+        <w:spacing w:after="40" w:line="240" w:lineRule="auto"/>
+        <w:ind w:left="360" w:hanging="260"/>
+        <w:rPr>
+          <w:rFonts w:ascii="Times New Roman" w:cs="Times New Roman" w:eastAsia="Times New Roman" w:hAnsi="Times New Roman"/>
+          <w:sz w:val="20"/>
+          <w:szCs w:val="20"/>
+        </w:rPr>
+      </w:pPr>
+      <w:r>
+        <w:rPr>
+          <w:color w:val="374151"/>
+          <w:sz w:val="20"/>
+          <w:szCs w:val="20"/>
+          <w:rtl w:val="0"/>
+        </w:rPr>
+        <w:t xml:space="preserve">Deployed in a secure AWS environment using OAuth 2.0, CloudFormation, and IAM policies for consistent, auditable provisioning.</w:t>
+      </w:r>
+      <w:r>
+        <w:rPr>
+          <w:rtl w:val="0"/>
+        </w:rPr>
+      </w:r>
+    </w:p>
+    <w:p>
+      <w:pPr>
+        <w:tabs>
+          <w:tab w:val="right" w:leader="none" w:pos="9360"/>
+        </w:tabs>
+        <w:spacing w:after="20" w:before="100" w:line="240" w:lineRule="auto"/>
+        <w:rPr>
+          <w:rFonts w:ascii="Times New Roman" w:cs="Times New Roman" w:eastAsia="Times New Roman" w:hAnsi="Times New Roman"/>
+          <w:sz w:val="20"/>
+          <w:szCs w:val="20"/>
+        </w:rPr>
+      </w:pPr>
+      <w:r>
+        <w:rPr>
+          <w:b w:val="1"/>
+          <w:bCs w:val="1"/>
+          <w:color w:val="111827"/>
+          <w:rtl w:val="0"/>
+        </w:rPr>
+        <w:t xml:space="preserve">Software Developer</w:t>
+      </w:r>
+      <w:r>
+        <w:rPr>
+          <w:color w:val="6b7280"/>
+          <w:sz w:val="20"/>
+          <w:szCs w:val="20"/>
+          <w:rtl w:val="0"/>
+        </w:rPr>
+        <w:t xml:space="preserve">  </w:t>
+      </w:r>
+      <w:r>
+        <w:rPr>
+          <w:color w:val="374151"/>
+          <w:sz w:val="20"/>
+          <w:szCs w:val="20"/>
+          <w:rtl w:val="0"/>
+        </w:rPr>
+        <w:t xml:space="preserve"> |</w:t>
+      </w:r>
+      <w:r>
+        <w:rPr>
+          <w:color w:val="6b7280"/>
+          <w:sz w:val="20"/>
+          <w:szCs w:val="20"/>
+          <w:rtl w:val="0"/>
+        </w:rPr>
+        <w:t xml:space="preserve">  </w:t>
+      </w:r>
+      <w:r>
+        <w:rPr>
+          <w:b w:val="1"/>
+          <w:bCs w:val="1"/>
+          <w:color w:val="1a56db"/>
+          <w:sz w:val="21"/>
+          <w:szCs w:val="21"/>
+          <w:rtl w:val="0"/>
+        </w:rPr>
+        <w:t xml:space="preserve">University of Utah – Dept. of Human Genetics</w:t>
+        <w:tab/>
+      </w:r>
+      <w:r>
+        <w:rPr>
+          <w:i w:val="1"/>
+          <w:iCs w:val="1"/>
+          <w:color w:val="6b7280"/>
+          <w:sz w:val="20"/>
+          <w:szCs w:val="20"/>
+          <w:rtl w:val="0"/>
+        </w:rPr>
+        <w:t xml:space="preserve">Jun 2017 – Apr 2019</w:t>
+      </w:r>
+      <w:r>
+        <w:rPr>
+          <w:rtl w:val="0"/>
+        </w:rPr>
+      </w:r>
+    </w:p>
+    <w:p>
+      <w:pPr>
+        <w:numPr>
+          <w:ilvl w:val="0"/>
+          <w:numId w:val="1"/>
+        </w:numPr>
+        <w:spacing w:after="40" w:line="240" w:lineRule="auto"/>
+        <w:ind w:left="360" w:hanging="260"/>
+        <w:rPr>
+          <w:rFonts w:ascii="Times New Roman" w:cs="Times New Roman" w:eastAsia="Times New Roman" w:hAnsi="Times New Roman"/>
+          <w:sz w:val="20"/>
+          <w:szCs w:val="20"/>
+        </w:rPr>
+      </w:pPr>
+      <w:r>
+        <w:rPr>
+          <w:color w:val="374151"/>
+          <w:sz w:val="20"/>
+          <w:szCs w:val="20"/>
+          <w:rtl w:val="0"/>
+        </w:rPr>
+        <w:t xml:space="preserve">Refactored genomic variant-detection pipelines in C++11/CMake, achieving a 10× build-time reduction; built high-throughput ALU detection tools using FASTAHACK, MINIMAP2, and lock-free hash tables.</w:t>
+      </w:r>
+      <w:r>
+        <w:rPr>
+          <w:rtl w:val="0"/>
+        </w:rPr>
+      </w:r>
+    </w:p>
+    <w:p>
+      <w:pPr>
+        <w:numPr>
+          <w:ilvl w:val="0"/>
+          <w:numId w:val="1"/>
+        </w:numPr>
+        <w:spacing w:after="40" w:line="240" w:lineRule="auto"/>
+        <w:ind w:left="360" w:hanging="260"/>
+        <w:rPr>
+          <w:rFonts w:ascii="Times New Roman" w:cs="Times New Roman" w:eastAsia="Times New Roman" w:hAnsi="Times New Roman"/>
+          <w:sz w:val="20"/>
+          <w:szCs w:val="20"/>
+        </w:rPr>
+      </w:pPr>
+      <w:r>
+        <w:rPr>
+          <w:color w:val="374151"/>
+          <w:sz w:val="20"/>
+          <w:szCs w:val="20"/>
+          <w:rtl w:val="0"/>
+        </w:rPr>
+        <w:t xml:space="preserve">Trained TensorFlow CNN classifiers to detect tissue contamination in xenograft genomic data, achieving 92% accuracy for downstream oncological research.</w:t>
+      </w:r>
+    </w:p>
+    <w:p>
+      <w:pPr>
+        <w:pBdr>
+          <w:bottom w:color="1a56db" w:space="0" w:sz="6" w:val="single"/>
+        </w:pBdr>
+        <w:spacing w:after="60" w:before="120" w:line="240" w:lineRule="auto"/>
+        <w:rPr>
+          <w:rFonts w:ascii="Times New Roman" w:cs="Times New Roman" w:eastAsia="Times New Roman" w:hAnsi="Times New Roman"/>
+          <w:sz w:val="20"/>
+          <w:szCs w:val="20"/>
+        </w:rPr>
+      </w:pPr>
+      <w:r>
+        <w:rPr>
+          <w:b w:val="1"/>
+          <w:bCs w:val="1"/>
+          <w:color w:val="1a56db"/>
+          <w:sz w:val="18"/>
+          <w:szCs w:val="18"/>
+          <w:rtl w:val="0"/>
+        </w:rPr>
+        <w:t xml:space="preserve">PROJECTS</w:t>
+      </w:r>
+      <w:r>
+        <w:rPr>
+          <w:rtl w:val="0"/>
+        </w:rPr>
+      </w:r>
+    </w:p>
+    <w:p>
+      <w:pPr>
+        <w:tabs>
+          <w:tab w:val="right" w:leader="none" w:pos="9360"/>
+        </w:tabs>
+        <w:spacing w:after="20" w:before="60" w:line="240" w:lineRule="auto"/>
+        <w:rPr>
+          <w:color w:val="374151"/>
+          <w:sz w:val="20"/>
+          <w:szCs w:val="20"/>
+        </w:rPr>
+      </w:pPr>
+      <w:r>
+        <w:rPr>
+          <w:b w:val="1"/>
+          <w:bCs w:val="1"/>
+          <w:color w:val="111827"/>
+          <w:sz w:val="21"/>
+          <w:szCs w:val="21"/>
+          <w:rtl w:val="0"/>
+        </w:rPr>
+        <w:t xml:space="preserve">Blotify</w:t>
+      </w:r>
+      <w:r>
+        <w:rPr>
+          <w:color w:val="374151"/>
+          <w:sz w:val="20"/>
+          <w:szCs w:val="20"/>
+          <w:rtl w:val="0"/>
+        </w:rPr>
+        <w:t xml:space="preserve">  |  React, Next.js  |  Automated western blot and cytokine array quantification; deployed and actively used as a production research tool at a university lab  |  </w:t>
+      </w:r>
+      <w:hyperlink r:id="rId8">
+        <w:r>
+          <w:rPr>
+            <w:sz w:val="20"/>
+            <w:szCs w:val="20"/>
+            <w:rtl w:val="0"/>
+          </w:rPr>
+          <w:t xml:space="preserve">blotify.dev</w:t>
+        </w:r>
+      </w:hyperlink>
       <w:r>
         <w:rPr>
           <w:rtl w:val="0"/>
@@ -788,687 +1469,6 @@
         </w:tc>
       </w:tr>
     </w:tbl>
-    <w:p>
-      <w:pPr>
-        <w:spacing w:line="80" w:lineRule="auto"/>
-        <w:rPr>
-          <w:rFonts w:ascii="Times New Roman" w:cs="Times New Roman" w:eastAsia="Times New Roman" w:hAnsi="Times New Roman"/>
-          <w:sz w:val="20"/>
-          <w:szCs w:val="20"/>
-        </w:rPr>
-      </w:pPr>
-      <w:r>
-        <w:rPr>
-          <w:rtl w:val="0"/>
-        </w:rPr>
-      </w:r>
-    </w:p>
-    <w:p>
-      <w:pPr>
-        <w:pBdr>
-          <w:bottom w:color="1a56db" w:space="0" w:sz="6" w:val="single"/>
-        </w:pBdr>
-        <w:spacing w:after="60" w:before="120" w:line="240" w:lineRule="auto"/>
-        <w:rPr>
-          <w:rFonts w:ascii="Times New Roman" w:cs="Times New Roman" w:eastAsia="Times New Roman" w:hAnsi="Times New Roman"/>
-          <w:sz w:val="20"/>
-          <w:szCs w:val="20"/>
-        </w:rPr>
-      </w:pPr>
-      <w:r>
-        <w:rPr>
-          <w:b w:val="1"/>
-          <w:bCs w:val="1"/>
-          <w:color w:val="1a56db"/>
-          <w:sz w:val="18"/>
-          <w:szCs w:val="18"/>
-          <w:rtl w:val="0"/>
-        </w:rPr>
-        <w:t xml:space="preserve">EXPERIENCE</w:t>
-      </w:r>
-      <w:r>
-        <w:rPr>
-          <w:rtl w:val="0"/>
-        </w:rPr>
-      </w:r>
-    </w:p>
-    <w:p>
-      <w:pPr>
-        <w:tabs>
-          <w:tab w:val="right" w:leader="none" w:pos="9360"/>
-        </w:tabs>
-        <w:spacing w:after="20" w:before="100" w:line="240" w:lineRule="auto"/>
-        <w:rPr>
-          <w:rFonts w:ascii="Times New Roman" w:cs="Times New Roman" w:eastAsia="Times New Roman" w:hAnsi="Times New Roman"/>
-          <w:sz w:val="20"/>
-          <w:szCs w:val="20"/>
-        </w:rPr>
-      </w:pPr>
-      <w:r>
-        <w:rPr>
-          <w:b w:val="1"/>
-          <w:bCs w:val="1"/>
-          <w:color w:val="111827"/>
-          <w:rtl w:val="0"/>
-        </w:rPr>
-        <w:t xml:space="preserve">Senior Front-End Engineer</w:t>
-      </w:r>
-      <w:r>
-        <w:rPr>
-          <w:color w:val="6b7280"/>
-          <w:sz w:val="20"/>
-          <w:szCs w:val="20"/>
-          <w:rtl w:val="0"/>
-        </w:rPr>
-        <w:t xml:space="preserve">  </w:t>
-      </w:r>
-      <w:r>
-        <w:rPr>
-          <w:color w:val="374151"/>
-          <w:sz w:val="20"/>
-          <w:szCs w:val="20"/>
-          <w:rtl w:val="0"/>
-        </w:rPr>
-        <w:t xml:space="preserve"> |</w:t>
-      </w:r>
-      <w:r>
-        <w:rPr>
-          <w:color w:val="6b7280"/>
-          <w:sz w:val="20"/>
-          <w:szCs w:val="20"/>
-          <w:rtl w:val="0"/>
-        </w:rPr>
-        <w:t xml:space="preserve">  </w:t>
-      </w:r>
-      <w:r>
-        <w:rPr>
-          <w:b w:val="1"/>
-          <w:bCs w:val="1"/>
-          <w:color w:val="1a56db"/>
-          <w:sz w:val="21"/>
-          <w:szCs w:val="21"/>
-          <w:rtl w:val="0"/>
-        </w:rPr>
-        <w:t xml:space="preserve">ModelOp</w:t>
-        <w:tab/>
-      </w:r>
-      <w:r>
-        <w:rPr>
-          <w:i w:val="1"/>
-          <w:iCs w:val="1"/>
-          <w:color w:val="6b7280"/>
-          <w:sz w:val="20"/>
-          <w:szCs w:val="20"/>
-          <w:rtl w:val="0"/>
-        </w:rPr>
-        <w:t xml:space="preserve">Apr 2021 – Present</w:t>
-      </w:r>
-      <w:r>
-        <w:rPr>
-          <w:rtl w:val="0"/>
-        </w:rPr>
-      </w:r>
-    </w:p>
-    <w:p>
-      <w:pPr>
-        <w:numPr>
-          <w:ilvl w:val="0"/>
-          <w:numId w:val="1"/>
-        </w:numPr>
-        <w:spacing w:after="40" w:line="240" w:lineRule="auto"/>
-        <w:ind w:left="360" w:hanging="260"/>
-        <w:rPr>
-          <w:rFonts w:ascii="Times New Roman" w:cs="Times New Roman" w:eastAsia="Times New Roman" w:hAnsi="Times New Roman"/>
-          <w:sz w:val="20"/>
-          <w:szCs w:val="20"/>
-        </w:rPr>
-      </w:pPr>
-      <w:r>
-        <w:rPr>
-          <w:color w:val="374151"/>
-          <w:sz w:val="20"/>
-          <w:szCs w:val="20"/>
-          <w:rtl w:val="0"/>
-        </w:rPr>
-        <w:t xml:space="preserve">Owned front-end architecture end-to-end for an AI governance platform serving Fortune 100 clients, leading feature delivery across Angular 17+, TypeScript, RxJS, NgRx, and SCSS with zero critical regressions across major releases.</w:t>
-      </w:r>
-      <w:r>
-        <w:rPr>
-          <w:rtl w:val="0"/>
-        </w:rPr>
-      </w:r>
-    </w:p>
-    <w:p>
-      <w:pPr>
-        <w:numPr>
-          <w:ilvl w:val="0"/>
-          <w:numId w:val="1"/>
-        </w:numPr>
-        <w:spacing w:after="40" w:line="240" w:lineRule="auto"/>
-        <w:ind w:left="360" w:hanging="260"/>
-        <w:rPr>
-          <w:rFonts w:ascii="Times New Roman" w:cs="Times New Roman" w:eastAsia="Times New Roman" w:hAnsi="Times New Roman"/>
-          <w:sz w:val="20"/>
-          <w:szCs w:val="20"/>
-        </w:rPr>
-      </w:pPr>
-      <w:r>
-        <w:rPr>
-          <w:color w:val="374151"/>
-          <w:sz w:val="20"/>
-          <w:szCs w:val="20"/>
-          <w:rtl w:val="0"/>
-        </w:rPr>
-        <w:t xml:space="preserve">Drove a performance and accessibility overhaul: achieved WCAG 2.2 AA compliance and 320px responsiveness while cutting initial load time 40% and bundle size 60% via Lazy Loading and Tree Shaking.</w:t>
-      </w:r>
-      <w:r>
-        <w:rPr>
-          <w:rtl w:val="0"/>
-        </w:rPr>
-      </w:r>
-    </w:p>
-    <w:p>
-      <w:pPr>
-        <w:numPr>
-          <w:ilvl w:val="0"/>
-          <w:numId w:val="1"/>
-        </w:numPr>
-        <w:spacing w:after="40" w:line="240" w:lineRule="auto"/>
-        <w:ind w:left="360" w:hanging="260"/>
-        <w:rPr>
-          <w:rFonts w:ascii="Times New Roman" w:cs="Times New Roman" w:eastAsia="Times New Roman" w:hAnsi="Times New Roman"/>
-          <w:sz w:val="20"/>
-          <w:szCs w:val="20"/>
-        </w:rPr>
-      </w:pPr>
-      <w:r>
-        <w:rPr>
-          <w:color w:val="374151"/>
-          <w:sz w:val="20"/>
-          <w:szCs w:val="20"/>
-          <w:rtl w:val="0"/>
-        </w:rPr>
-        <w:t xml:space="preserve">Introduced Tailwind CSS and a token-based design system (SCSS + Figma Tokens Studio) across a 5-engineer front-end team, standardizing styling conventions and eliminating a class of style-related bugs.</w:t>
-      </w:r>
-      <w:r>
-        <w:rPr>
-          <w:rtl w:val="0"/>
-        </w:rPr>
-      </w:r>
-    </w:p>
-    <w:p>
-      <w:pPr>
-        <w:numPr>
-          <w:ilvl w:val="0"/>
-          <w:numId w:val="1"/>
-        </w:numPr>
-        <w:spacing w:after="40" w:line="240" w:lineRule="auto"/>
-        <w:ind w:left="360" w:hanging="260"/>
-        <w:rPr>
-          <w:rFonts w:ascii="Times New Roman" w:cs="Times New Roman" w:eastAsia="Times New Roman" w:hAnsi="Times New Roman"/>
-          <w:sz w:val="20"/>
-          <w:szCs w:val="20"/>
-        </w:rPr>
-      </w:pPr>
-      <w:r>
-        <w:rPr>
-          <w:color w:val="374151"/>
-          <w:sz w:val="20"/>
-          <w:szCs w:val="20"/>
-          <w:rtl w:val="0"/>
-        </w:rPr>
-        <w:t xml:space="preserve">Built a test automation SDK in Python abstracting common UI workflows into reusable, composable functions, enabling scalable pytest/Selenium test authoring; automated 20 of 400 manual regression tests as an initial implementation</w:t>
-      </w:r>
-      <w:r>
-        <w:rPr>
-          <w:rtl w:val="0"/>
-        </w:rPr>
-      </w:r>
-    </w:p>
-    <w:p>
-      <w:pPr>
-        <w:numPr>
-          <w:ilvl w:val="0"/>
-          <w:numId w:val="1"/>
-        </w:numPr>
-        <w:spacing w:after="40" w:line="240" w:lineRule="auto"/>
-        <w:ind w:left="360" w:hanging="260"/>
-        <w:rPr>
-          <w:rFonts w:ascii="Times New Roman" w:cs="Times New Roman" w:eastAsia="Times New Roman" w:hAnsi="Times New Roman"/>
-          <w:sz w:val="20"/>
-          <w:szCs w:val="20"/>
-        </w:rPr>
-      </w:pPr>
-      <w:r>
-        <w:rPr>
-          <w:color w:val="374151"/>
-          <w:sz w:val="20"/>
-          <w:szCs w:val="20"/>
-          <w:rtl w:val="0"/>
-        </w:rPr>
-        <w:t xml:space="preserve">Contributed Spring Data JPA repository methods using derived query conventions; collaborated across Docker and Kubernetes environments to diagnose and resolve production issues alongside Java team.</w:t>
-      </w:r>
-      <w:r>
-        <w:rPr>
-          <w:rtl w:val="0"/>
-        </w:rPr>
-      </w:r>
-    </w:p>
-    <w:p>
-      <w:pPr>
-        <w:numPr>
-          <w:ilvl w:val="0"/>
-          <w:numId w:val="1"/>
-        </w:numPr>
-        <w:spacing w:after="40" w:line="240" w:lineRule="auto"/>
-        <w:ind w:left="360" w:hanging="260"/>
-        <w:rPr>
-          <w:rFonts w:ascii="Times New Roman" w:cs="Times New Roman" w:eastAsia="Times New Roman" w:hAnsi="Times New Roman"/>
-          <w:sz w:val="20"/>
-          <w:szCs w:val="20"/>
-        </w:rPr>
-      </w:pPr>
-      <w:r>
-        <w:rPr>
-          <w:color w:val="374151"/>
-          <w:sz w:val="20"/>
-          <w:szCs w:val="20"/>
-          <w:rtl w:val="0"/>
-        </w:rPr>
-        <w:t xml:space="preserve">Refactored change detection to a zoneless, signal-based architecture, eliminating Zone.js overhead and reducing unnecessary CD cycles; measured runtime improvements via Lighthouse, yielding meaningful reductions in Total Blocking Time (TBT).</w:t>
-      </w:r>
-      <w:r>
-        <w:rPr>
-          <w:rtl w:val="0"/>
-        </w:rPr>
-      </w:r>
-    </w:p>
-    <w:p>
-      <w:pPr>
-        <w:numPr>
-          <w:ilvl w:val="0"/>
-          <w:numId w:val="1"/>
-        </w:numPr>
-        <w:spacing w:after="40" w:line="240" w:lineRule="auto"/>
-        <w:ind w:left="360" w:hanging="260"/>
-        <w:rPr>
-          <w:rFonts w:ascii="Times New Roman" w:cs="Times New Roman" w:eastAsia="Times New Roman" w:hAnsi="Times New Roman"/>
-          <w:sz w:val="20"/>
-          <w:szCs w:val="20"/>
-        </w:rPr>
-      </w:pPr>
-      <w:r>
-        <w:rPr>
-          <w:color w:val="374151"/>
-          <w:sz w:val="20"/>
-          <w:szCs w:val="20"/>
-          <w:rtl w:val="0"/>
-        </w:rPr>
-        <w:t xml:space="preserve">Drove adoption of Chart.js, Angular 17, and AI development tooling by presenting technical roadmaps to the Director of UI/UX, VP of Product, and CTO.</w:t>
-      </w:r>
-      <w:r>
-        <w:rPr>
-          <w:rtl w:val="0"/>
-        </w:rPr>
-      </w:r>
-    </w:p>
-    <w:p>
-      <w:pPr>
-        <w:spacing w:line="80" w:lineRule="auto"/>
-        <w:rPr>
-          <w:rFonts w:ascii="Times New Roman" w:cs="Times New Roman" w:eastAsia="Times New Roman" w:hAnsi="Times New Roman"/>
-          <w:sz w:val="20"/>
-          <w:szCs w:val="20"/>
-        </w:rPr>
-      </w:pPr>
-      <w:r>
-        <w:rPr>
-          <w:rtl w:val="0"/>
-        </w:rPr>
-      </w:r>
-    </w:p>
-    <w:p>
-      <w:pPr>
-        <w:tabs>
-          <w:tab w:val="right" w:leader="none" w:pos="9360"/>
-        </w:tabs>
-        <w:spacing w:after="20" w:before="100" w:line="240" w:lineRule="auto"/>
-        <w:rPr>
-          <w:rFonts w:ascii="Times New Roman" w:cs="Times New Roman" w:eastAsia="Times New Roman" w:hAnsi="Times New Roman"/>
-          <w:sz w:val="20"/>
-          <w:szCs w:val="20"/>
-        </w:rPr>
-      </w:pPr>
-      <w:r>
-        <w:rPr>
-          <w:b w:val="1"/>
-          <w:bCs w:val="1"/>
-          <w:color w:val="111827"/>
-          <w:rtl w:val="0"/>
-        </w:rPr>
-        <w:t xml:space="preserve">Web Developer</w:t>
-      </w:r>
-      <w:r>
-        <w:rPr>
-          <w:color w:val="6b7280"/>
-          <w:sz w:val="20"/>
-          <w:szCs w:val="20"/>
-          <w:rtl w:val="0"/>
-        </w:rPr>
-        <w:t xml:space="preserve">  </w:t>
-      </w:r>
-      <w:r>
-        <w:rPr>
-          <w:color w:val="374151"/>
-          <w:sz w:val="20"/>
-          <w:szCs w:val="20"/>
-          <w:rtl w:val="0"/>
-        </w:rPr>
-        <w:t xml:space="preserve"> |</w:t>
-      </w:r>
-      <w:r>
-        <w:rPr>
-          <w:color w:val="6b7280"/>
-          <w:sz w:val="20"/>
-          <w:szCs w:val="20"/>
-          <w:rtl w:val="0"/>
-        </w:rPr>
-        <w:t xml:space="preserve">  </w:t>
-      </w:r>
-      <w:r>
-        <w:rPr>
-          <w:b w:val="1"/>
-          <w:bCs w:val="1"/>
-          <w:color w:val="1a56db"/>
-          <w:sz w:val="21"/>
-          <w:szCs w:val="21"/>
-          <w:rtl w:val="0"/>
-        </w:rPr>
-        <w:t xml:space="preserve">University of Utah – Dept. of Human Genetics</w:t>
-        <w:tab/>
-      </w:r>
-      <w:r>
-        <w:rPr>
-          <w:i w:val="1"/>
-          <w:iCs w:val="1"/>
-          <w:color w:val="6b7280"/>
-          <w:sz w:val="20"/>
-          <w:szCs w:val="20"/>
-          <w:rtl w:val="0"/>
-        </w:rPr>
-        <w:t xml:space="preserve">May 2019 – Dec 2020</w:t>
-      </w:r>
-      <w:r>
-        <w:rPr>
-          <w:rtl w:val="0"/>
-        </w:rPr>
-      </w:r>
-    </w:p>
-    <w:p>
-      <w:pPr>
-        <w:numPr>
-          <w:ilvl w:val="0"/>
-          <w:numId w:val="1"/>
-        </w:numPr>
-        <w:spacing w:after="40" w:line="240" w:lineRule="auto"/>
-        <w:ind w:left="360" w:hanging="260"/>
-        <w:rPr>
-          <w:rFonts w:ascii="Times New Roman" w:cs="Times New Roman" w:eastAsia="Times New Roman" w:hAnsi="Times New Roman"/>
-          <w:sz w:val="20"/>
-          <w:szCs w:val="20"/>
-        </w:rPr>
-      </w:pPr>
-      <w:r>
-        <w:rPr>
-          <w:color w:val="374151"/>
-          <w:sz w:val="20"/>
-          <w:szCs w:val="20"/>
-          <w:rtl w:val="0"/>
-        </w:rPr>
-        <w:t xml:space="preserve">Built a genomic pedigree visualization platform with Vue, D3, and Node.js; leveraged Vuex, Web Workers, and OffscreenCanvas for high-interactivity rendering.</w:t>
-      </w:r>
-      <w:r>
-        <w:rPr>
-          <w:rtl w:val="0"/>
-        </w:rPr>
-      </w:r>
-    </w:p>
-    <w:p>
-      <w:pPr>
-        <w:numPr>
-          <w:ilvl w:val="0"/>
-          <w:numId w:val="1"/>
-        </w:numPr>
-        <w:spacing w:after="40" w:line="240" w:lineRule="auto"/>
-        <w:ind w:left="360" w:hanging="260"/>
-        <w:rPr>
-          <w:rFonts w:ascii="Times New Roman" w:cs="Times New Roman" w:eastAsia="Times New Roman" w:hAnsi="Times New Roman"/>
-          <w:sz w:val="20"/>
-          <w:szCs w:val="20"/>
-        </w:rPr>
-      </w:pPr>
-      <w:r>
-        <w:rPr>
-          <w:color w:val="374151"/>
-          <w:sz w:val="20"/>
-          <w:szCs w:val="20"/>
-          <w:rtl w:val="0"/>
-        </w:rPr>
-        <w:t xml:space="preserve">Deployed in a secure AWS environment using OAuth 2.0, CloudFormation, and IAM policies for consistent, auditable provisioning.</w:t>
-      </w:r>
-      <w:r>
-        <w:rPr>
-          <w:rtl w:val="0"/>
-        </w:rPr>
-      </w:r>
-    </w:p>
-    <w:p>
-      <w:pPr>
-        <w:tabs>
-          <w:tab w:val="right" w:leader="none" w:pos="9360"/>
-        </w:tabs>
-        <w:spacing w:after="20" w:before="100" w:line="240" w:lineRule="auto"/>
-        <w:rPr>
-          <w:rFonts w:ascii="Times New Roman" w:cs="Times New Roman" w:eastAsia="Times New Roman" w:hAnsi="Times New Roman"/>
-          <w:sz w:val="20"/>
-          <w:szCs w:val="20"/>
-        </w:rPr>
-      </w:pPr>
-      <w:r>
-        <w:rPr>
-          <w:b w:val="1"/>
-          <w:bCs w:val="1"/>
-          <w:color w:val="111827"/>
-          <w:rtl w:val="0"/>
-        </w:rPr>
-        <w:t xml:space="preserve">Software Developer</w:t>
-      </w:r>
-      <w:r>
-        <w:rPr>
-          <w:color w:val="6b7280"/>
-          <w:sz w:val="20"/>
-          <w:szCs w:val="20"/>
-          <w:rtl w:val="0"/>
-        </w:rPr>
-        <w:t xml:space="preserve">  </w:t>
-      </w:r>
-      <w:r>
-        <w:rPr>
-          <w:color w:val="374151"/>
-          <w:sz w:val="20"/>
-          <w:szCs w:val="20"/>
-          <w:rtl w:val="0"/>
-        </w:rPr>
-        <w:t xml:space="preserve"> |</w:t>
-      </w:r>
-      <w:r>
-        <w:rPr>
-          <w:color w:val="6b7280"/>
-          <w:sz w:val="20"/>
-          <w:szCs w:val="20"/>
-          <w:rtl w:val="0"/>
-        </w:rPr>
-        <w:t xml:space="preserve">  </w:t>
-      </w:r>
-      <w:r>
-        <w:rPr>
-          <w:b w:val="1"/>
-          <w:bCs w:val="1"/>
-          <w:color w:val="1a56db"/>
-          <w:sz w:val="21"/>
-          <w:szCs w:val="21"/>
-          <w:rtl w:val="0"/>
-        </w:rPr>
-        <w:t xml:space="preserve">University of Utah – Dept. of Human Genetics</w:t>
-        <w:tab/>
-      </w:r>
-      <w:r>
-        <w:rPr>
-          <w:i w:val="1"/>
-          <w:iCs w:val="1"/>
-          <w:color w:val="6b7280"/>
-          <w:sz w:val="20"/>
-          <w:szCs w:val="20"/>
-          <w:rtl w:val="0"/>
-        </w:rPr>
-        <w:t xml:space="preserve">Jun 2017 – Apr 2019</w:t>
-      </w:r>
-      <w:r>
-        <w:rPr>
-          <w:rtl w:val="0"/>
-        </w:rPr>
-      </w:r>
-    </w:p>
-    <w:p>
-      <w:pPr>
-        <w:numPr>
-          <w:ilvl w:val="0"/>
-          <w:numId w:val="1"/>
-        </w:numPr>
-        <w:spacing w:after="40" w:line="240" w:lineRule="auto"/>
-        <w:ind w:left="360" w:hanging="260"/>
-        <w:rPr>
-          <w:rFonts w:ascii="Times New Roman" w:cs="Times New Roman" w:eastAsia="Times New Roman" w:hAnsi="Times New Roman"/>
-          <w:sz w:val="20"/>
-          <w:szCs w:val="20"/>
-        </w:rPr>
-      </w:pPr>
-      <w:r>
-        <w:rPr>
-          <w:color w:val="374151"/>
-          <w:sz w:val="20"/>
-          <w:szCs w:val="20"/>
-          <w:rtl w:val="0"/>
-        </w:rPr>
-        <w:t xml:space="preserve">Refactored genomic variant-detection pipelines in C++11/CMake, achieving a 10× build-time reduction; built high-throughput ALU detection tools using FASTAHACK, MINIMAP2, and lock-free hash tables.</w:t>
-      </w:r>
-      <w:r>
-        <w:rPr>
-          <w:rtl w:val="0"/>
-        </w:rPr>
-      </w:r>
-    </w:p>
-    <w:p>
-      <w:pPr>
-        <w:numPr>
-          <w:ilvl w:val="0"/>
-          <w:numId w:val="1"/>
-        </w:numPr>
-        <w:spacing w:after="40" w:line="240" w:lineRule="auto"/>
-        <w:ind w:left="360" w:hanging="260"/>
-        <w:rPr>
-          <w:rFonts w:ascii="Times New Roman" w:cs="Times New Roman" w:eastAsia="Times New Roman" w:hAnsi="Times New Roman"/>
-          <w:sz w:val="20"/>
-          <w:szCs w:val="20"/>
-        </w:rPr>
-      </w:pPr>
-      <w:r>
-        <w:rPr>
-          <w:color w:val="374151"/>
-          <w:sz w:val="20"/>
-          <w:szCs w:val="20"/>
-          <w:rtl w:val="0"/>
-        </w:rPr>
-        <w:t xml:space="preserve">Trained TensorFlow CNN classifiers to detect tissue contamination in xenograft genomic data, achieving 92% accuracy for downstream oncological research.</w:t>
-      </w:r>
-    </w:p>
-    <w:p>
-      <w:pPr>
-        <w:pBdr>
-          <w:bottom w:color="1a56db" w:space="0" w:sz="6" w:val="single"/>
-        </w:pBdr>
-        <w:spacing w:after="60" w:before="120" w:line="240" w:lineRule="auto"/>
-        <w:rPr>
-          <w:rFonts w:ascii="Times New Roman" w:cs="Times New Roman" w:eastAsia="Times New Roman" w:hAnsi="Times New Roman"/>
-          <w:sz w:val="20"/>
-          <w:szCs w:val="20"/>
-        </w:rPr>
-      </w:pPr>
-      <w:r>
-        <w:rPr>
-          <w:b w:val="1"/>
-          <w:bCs w:val="1"/>
-          <w:color w:val="1a56db"/>
-          <w:sz w:val="18"/>
-          <w:szCs w:val="18"/>
-          <w:rtl w:val="0"/>
-        </w:rPr>
-        <w:t xml:space="preserve">PROJECTS</w:t>
-      </w:r>
-      <w:r>
-        <w:rPr>
-          <w:rtl w:val="0"/>
-        </w:rPr>
-      </w:r>
-    </w:p>
-    <w:p>
-      <w:pPr>
-        <w:tabs>
-          <w:tab w:val="right" w:leader="none" w:pos="9360"/>
-        </w:tabs>
-        <w:spacing w:after="20" w:before="60" w:line="240" w:lineRule="auto"/>
-        <w:rPr>
-          <w:color w:val="374151"/>
-          <w:sz w:val="20"/>
-          <w:szCs w:val="20"/>
-        </w:rPr>
-      </w:pPr>
-      <w:r>
-        <w:rPr>
-          <w:b w:val="1"/>
-          <w:bCs w:val="1"/>
-          <w:color w:val="111827"/>
-          <w:sz w:val="21"/>
-          <w:szCs w:val="21"/>
-          <w:rtl w:val="0"/>
-        </w:rPr>
-        <w:t xml:space="preserve">Blotify</w:t>
-      </w:r>
-      <w:r>
-        <w:rPr>
-          <w:color w:val="374151"/>
-          <w:sz w:val="20"/>
-          <w:szCs w:val="20"/>
-          <w:rtl w:val="0"/>
-        </w:rPr>
-        <w:t xml:space="preserve">  |  React, Next.js  |  Automated western blot and cytokine array quantification; deployed and actively used as a production research tool at a university lab  |  </w:t>
-      </w:r>
-      <w:hyperlink r:id="rId8">
-        <w:r>
-          <w:rPr>
-            <w:sz w:val="20"/>
-            <w:szCs w:val="20"/>
-            <w:rtl w:val="0"/>
-          </w:rPr>
-          <w:t xml:space="preserve">blotify.dev</w:t>
-        </w:r>
-      </w:hyperlink>
-      <w:r>
-        <w:rPr>
-          <w:rtl w:val="0"/>
-        </w:rPr>
-      </w:r>
-    </w:p>
     <w:p>
       <w:pPr>
         <w:spacing w:line="80" w:lineRule="auto"/>

</xml_diff>